<commit_message>
tech basic plan created
</commit_message>
<xml_diff>
--- a/Ai_for_techies.docx
+++ b/Ai_for_techies.docx
@@ -2,6 +2,1353 @@
 <file path=word/document.xml><?xml version="1.0" encoding="utf-8"?>
 <w:document xmlns:wpc="http://schemas.microsoft.com/office/word/2010/wordprocessingCanvas" xmlns:cx="http://schemas.microsoft.com/office/drawing/2014/chartex" xmlns:cx1="http://schemas.microsoft.com/office/drawing/2015/9/8/chartex" xmlns:cx2="http://schemas.microsoft.com/office/drawing/2015/10/21/chartex" xmlns:cx3="http://schemas.microsoft.com/office/drawing/2016/5/9/chartex" xmlns:cx4="http://schemas.microsoft.com/office/drawing/2016/5/10/chartex" xmlns:cx5="http://schemas.microsoft.com/office/drawing/2016/5/11/chartex" xmlns:cx6="http://schemas.microsoft.com/office/drawing/2016/5/12/chartex" xmlns:cx7="http://schemas.microsoft.com/office/drawing/2016/5/13/chartex" xmlns:cx8="http://schemas.microsoft.com/office/drawing/2016/5/14/chartex" xmlns:mc="http://schemas.openxmlformats.org/markup-compatibility/2006" xmlns:aink="http://schemas.microsoft.com/office/drawing/2016/ink" xmlns:am3d="http://schemas.microsoft.com/office/drawing/2017/model3d" xmlns:o="urn:schemas-microsoft-com:office:office" xmlns:oel="http://schemas.microsoft.com/office/2019/extlst" xmlns:r="http://schemas.openxmlformats.org/officeDocument/2006/relationships" xmlns:m="http://schemas.openxmlformats.org/officeDocument/2006/math" xmlns:v="urn:schemas-microsoft-com:vml" xmlns:wp14="http://schemas.microsoft.com/office/word/2010/wordprocessingDrawing" xmlns:wp="http://schemas.openxmlformats.org/drawingml/2006/wordprocessingDrawing" xmlns:w10="urn:schemas-microsoft-com:office:word" xmlns:w="http://schemas.openxmlformats.org/wordprocessingml/2006/main" xmlns:w14="http://schemas.microsoft.com/office/word/2010/wordml" xmlns:w15="http://schemas.microsoft.com/office/word/2012/wordml" xmlns:w16cex="http://schemas.microsoft.com/office/word/2018/wordml/cex" xmlns:w16cid="http://schemas.microsoft.com/office/word/2016/wordml/cid" xmlns:w16="http://schemas.microsoft.com/office/word/2018/wordml" xmlns:w16du="http://schemas.microsoft.com/office/word/2023/wordml/word16du" xmlns:w16sdtdh="http://schemas.microsoft.com/office/word/2020/wordml/sdtdatahash" xmlns:w16sdtfl="http://schemas.microsoft.com/office/word/2024/wordml/sdtformatlock" xmlns:w16se="http://schemas.microsoft.com/office/word/2015/wordml/symex" xmlns:wpg="http://schemas.microsoft.com/office/word/2010/wordprocessingGroup" xmlns:wpi="http://schemas.microsoft.com/office/word/2010/wordprocessingInk" xmlns:wne="http://schemas.microsoft.com/office/word/2006/wordml" xmlns:wps="http://schemas.microsoft.com/office/word/2010/wordprocessingShape" mc:Ignorable="w14 w15 w16se w16cid w16 w16cex w16sdtdh w16sdtfl w16du wp14">
   <w:body>
+    <w:p>
+      <w:pPr>
+        <w:ind w:firstLine="720"/>
+        <w:rPr>
+          <w:b/>
+          <w:bCs/>
+        </w:rPr>
+      </w:pPr>
+      <w:r>
+        <w:rPr>
+          <w:b/>
+          <w:bCs/>
+        </w:rPr>
+        <w:t>LIB-AI – Tech -Basic</w:t>
+      </w:r>
+    </w:p>
+    <w:tbl>
+      <w:tblPr>
+        <w:tblStyle w:val="TableGrid"/>
+        <w:tblW w:w="0" w:type="auto"/>
+        <w:tblInd w:w="6" w:type="dxa"/>
+        <w:tblLook w:val="04A0" w:firstRow="1" w:lastRow="0" w:firstColumn="1" w:lastColumn="0" w:noHBand="0" w:noVBand="1"/>
+      </w:tblPr>
+      <w:tblGrid>
+        <w:gridCol w:w="1265"/>
+        <w:gridCol w:w="2268"/>
+        <w:gridCol w:w="5477"/>
+      </w:tblGrid>
+      <w:tr>
+        <w:tc>
+          <w:tcPr>
+            <w:tcW w:w="1265" w:type="dxa"/>
+          </w:tcPr>
+          <w:p>
+            <w:pPr>
+              <w:rPr>
+                <w:b/>
+                <w:bCs/>
+              </w:rPr>
+            </w:pPr>
+            <w:r>
+              <w:rPr>
+                <w:b/>
+                <w:bCs/>
+              </w:rPr>
+              <w:t>Sessions</w:t>
+            </w:r>
+          </w:p>
+        </w:tc>
+        <w:tc>
+          <w:tcPr>
+            <w:tcW w:w="2268" w:type="dxa"/>
+          </w:tcPr>
+          <w:p>
+            <w:pPr>
+              <w:rPr>
+                <w:b/>
+                <w:bCs/>
+              </w:rPr>
+            </w:pPr>
+            <w:r>
+              <w:rPr>
+                <w:b/>
+                <w:bCs/>
+              </w:rPr>
+              <w:t>Main Theme</w:t>
+            </w:r>
+          </w:p>
+        </w:tc>
+        <w:tc>
+          <w:tcPr>
+            <w:tcW w:w="5477" w:type="dxa"/>
+          </w:tcPr>
+          <w:p>
+            <w:pPr>
+              <w:rPr>
+                <w:b/>
+                <w:bCs/>
+              </w:rPr>
+            </w:pPr>
+            <w:r>
+              <w:rPr>
+                <w:b/>
+                <w:bCs/>
+              </w:rPr>
+              <w:t>Topics covered</w:t>
+            </w:r>
+          </w:p>
+        </w:tc>
+      </w:tr>
+      <w:tr>
+        <w:trPr>
+          <w:trHeight w:val="483"/>
+        </w:trPr>
+        <w:tc>
+          <w:tcPr>
+            <w:tcW w:w="1265" w:type="dxa"/>
+          </w:tcPr>
+          <w:p>
+            <w:pPr>
+              <w:rPr>
+                <w:b/>
+                <w:bCs/>
+              </w:rPr>
+            </w:pPr>
+            <w:r>
+              <w:rPr>
+                <w:b/>
+                <w:bCs/>
+              </w:rPr>
+              <w:t>1</w:t>
+            </w:r>
+          </w:p>
+        </w:tc>
+        <w:tc>
+          <w:tcPr>
+            <w:tcW w:w="2268" w:type="dxa"/>
+          </w:tcPr>
+          <w:p>
+            <w:pPr>
+              <w:rPr>
+                <w:rFonts w:ascii="Aptos Narrow" w:hAnsi="Aptos Narrow"/>
+                <w:b/>
+                <w:bCs/>
+                <w:color w:val="000000"/>
+              </w:rPr>
+            </w:pPr>
+            <w:r>
+              <w:rPr>
+                <w:rFonts w:ascii="Aptos Narrow" w:hAnsi="Aptos Narrow"/>
+                <w:b/>
+                <w:bCs/>
+                <w:color w:val="000000"/>
+              </w:rPr>
+              <w:t>Introduction to ML</w:t>
+            </w:r>
+          </w:p>
+          <w:p>
+            <w:pPr>
+              <w:rPr>
+                <w:b/>
+                <w:bCs/>
+              </w:rPr>
+            </w:pPr>
+          </w:p>
+        </w:tc>
+        <w:tc>
+          <w:tcPr>
+            <w:tcW w:w="5477" w:type="dxa"/>
+          </w:tcPr>
+          <w:p>
+            <w:pPr>
+              <w:rPr>
+                <w:b/>
+                <w:bCs/>
+              </w:rPr>
+            </w:pPr>
+            <w:r>
+              <w:t>What is ML? Types of ML, ML pipeline, Applications</w:t>
+            </w:r>
+          </w:p>
+        </w:tc>
+      </w:tr>
+      <w:tr>
+        <w:tc>
+          <w:tcPr>
+            <w:tcW w:w="1265" w:type="dxa"/>
+          </w:tcPr>
+          <w:p>
+            <w:pPr>
+              <w:rPr>
+                <w:b/>
+                <w:bCs/>
+              </w:rPr>
+            </w:pPr>
+            <w:r>
+              <w:rPr>
+                <w:b/>
+                <w:bCs/>
+              </w:rPr>
+              <w:t>2</w:t>
+            </w:r>
+          </w:p>
+        </w:tc>
+        <w:tc>
+          <w:tcPr>
+            <w:tcW w:w="2268" w:type="dxa"/>
+          </w:tcPr>
+          <w:p>
+            <w:pPr>
+              <w:rPr>
+                <w:b/>
+                <w:bCs/>
+              </w:rPr>
+            </w:pPr>
+            <w:r>
+              <w:t>Data Handling &amp; Preprocessing</w:t>
+            </w:r>
+          </w:p>
+        </w:tc>
+        <w:tc>
+          <w:tcPr>
+            <w:tcW w:w="5477" w:type="dxa"/>
+          </w:tcPr>
+          <w:tbl>
+            <w:tblPr>
+              <w:tblW w:w="0" w:type="auto"/>
+              <w:tblCellSpacing w:w="15" w:type="dxa"/>
+              <w:tblCellMar>
+                <w:top w:w="15" w:type="dxa"/>
+                <w:left w:w="15" w:type="dxa"/>
+                <w:bottom w:w="15" w:type="dxa"/>
+                <w:right w:w="15" w:type="dxa"/>
+              </w:tblCellMar>
+              <w:tblLook w:val="04A0" w:firstRow="1" w:lastRow="0" w:firstColumn="1" w:lastColumn="0" w:noHBand="0" w:noVBand="1"/>
+            </w:tblPr>
+            <w:tblGrid>
+              <w:gridCol w:w="96"/>
+            </w:tblGrid>
+            <w:tr>
+              <w:trPr>
+                <w:tblCellSpacing w:w="15" w:type="dxa"/>
+              </w:trPr>
+              <w:tc>
+                <w:tcPr>
+                  <w:tcW w:w="0" w:type="auto"/>
+                  <w:vAlign w:val="center"/>
+                  <w:hideMark/>
+                </w:tcPr>
+                <w:p/>
+              </w:tc>
+            </w:tr>
+          </w:tbl>
+          <w:p>
+            <w:pPr>
+              <w:rPr>
+                <w:vanish/>
+              </w:rPr>
+            </w:pPr>
+          </w:p>
+          <w:tbl>
+            <w:tblPr>
+              <w:tblW w:w="0" w:type="auto"/>
+              <w:tblCellSpacing w:w="15" w:type="dxa"/>
+              <w:tblCellMar>
+                <w:top w:w="15" w:type="dxa"/>
+                <w:left w:w="15" w:type="dxa"/>
+                <w:bottom w:w="15" w:type="dxa"/>
+                <w:right w:w="15" w:type="dxa"/>
+              </w:tblCellMar>
+              <w:tblLook w:val="04A0" w:firstRow="1" w:lastRow="0" w:firstColumn="1" w:lastColumn="0" w:noHBand="0" w:noVBand="1"/>
+            </w:tblPr>
+            <w:tblGrid>
+              <w:gridCol w:w="5261"/>
+            </w:tblGrid>
+            <w:tr>
+              <w:trPr>
+                <w:tblCellSpacing w:w="15" w:type="dxa"/>
+              </w:trPr>
+              <w:tc>
+                <w:tcPr>
+                  <w:tcW w:w="0" w:type="auto"/>
+                  <w:vAlign w:val="center"/>
+                  <w:hideMark/>
+                </w:tcPr>
+                <w:p>
+                  <w:r>
+                    <w:t>Data types, Pandas, Data Cleaning, Feature Scaling, Encoding</w:t>
+                  </w:r>
+                </w:p>
+              </w:tc>
+            </w:tr>
+          </w:tbl>
+          <w:p>
+            <w:pPr>
+              <w:rPr>
+                <w:b/>
+                <w:bCs/>
+              </w:rPr>
+            </w:pPr>
+          </w:p>
+        </w:tc>
+      </w:tr>
+      <w:tr>
+        <w:tc>
+          <w:tcPr>
+            <w:tcW w:w="1265" w:type="dxa"/>
+          </w:tcPr>
+          <w:p>
+            <w:pPr>
+              <w:rPr>
+                <w:b/>
+                <w:bCs/>
+              </w:rPr>
+            </w:pPr>
+            <w:r>
+              <w:rPr>
+                <w:b/>
+                <w:bCs/>
+              </w:rPr>
+              <w:t>3</w:t>
+            </w:r>
+          </w:p>
+        </w:tc>
+        <w:tc>
+          <w:tcPr>
+            <w:tcW w:w="2268" w:type="dxa"/>
+          </w:tcPr>
+          <w:p>
+            <w:pPr>
+              <w:rPr>
+                <w:b/>
+                <w:bCs/>
+              </w:rPr>
+            </w:pPr>
+            <w:r>
+              <w:t>Regression</w:t>
+            </w:r>
+          </w:p>
+        </w:tc>
+        <w:tc>
+          <w:tcPr>
+            <w:tcW w:w="5477" w:type="dxa"/>
+          </w:tcPr>
+          <w:p>
+            <w:pPr>
+              <w:rPr>
+                <w:b/>
+                <w:bCs/>
+              </w:rPr>
+            </w:pPr>
+            <w:r>
+              <w:t>Linear Regression, Assumptions, Model Training</w:t>
+            </w:r>
+          </w:p>
+        </w:tc>
+      </w:tr>
+      <w:tr>
+        <w:tc>
+          <w:tcPr>
+            <w:tcW w:w="1265" w:type="dxa"/>
+          </w:tcPr>
+          <w:p>
+            <w:pPr>
+              <w:rPr>
+                <w:b/>
+                <w:bCs/>
+              </w:rPr>
+            </w:pPr>
+            <w:r>
+              <w:rPr>
+                <w:b/>
+                <w:bCs/>
+              </w:rPr>
+              <w:t>4</w:t>
+            </w:r>
+          </w:p>
+        </w:tc>
+        <w:tc>
+          <w:tcPr>
+            <w:tcW w:w="2268" w:type="dxa"/>
+          </w:tcPr>
+          <w:p>
+            <w:pPr>
+              <w:rPr>
+                <w:b/>
+                <w:bCs/>
+              </w:rPr>
+            </w:pPr>
+            <w:r>
+              <w:t>Regression</w:t>
+            </w:r>
+          </w:p>
+        </w:tc>
+        <w:tc>
+          <w:tcPr>
+            <w:tcW w:w="5477" w:type="dxa"/>
+          </w:tcPr>
+          <w:p>
+            <w:pPr>
+              <w:tabs>
+                <w:tab w:val="left" w:pos="1247"/>
+              </w:tabs>
+              <w:rPr>
+                <w:b/>
+                <w:bCs/>
+              </w:rPr>
+            </w:pPr>
+            <w:r>
+              <w:rPr>
+                <w:b/>
+                <w:bCs/>
+              </w:rPr>
+              <w:tab/>
+            </w:r>
+          </w:p>
+          <w:tbl>
+            <w:tblPr>
+              <w:tblW w:w="0" w:type="auto"/>
+              <w:tblCellSpacing w:w="15" w:type="dxa"/>
+              <w:tblCellMar>
+                <w:top w:w="15" w:type="dxa"/>
+                <w:left w:w="15" w:type="dxa"/>
+                <w:bottom w:w="15" w:type="dxa"/>
+                <w:right w:w="15" w:type="dxa"/>
+              </w:tblCellMar>
+              <w:tblLook w:val="04A0" w:firstRow="1" w:lastRow="0" w:firstColumn="1" w:lastColumn="0" w:noHBand="0" w:noVBand="1"/>
+            </w:tblPr>
+            <w:tblGrid>
+              <w:gridCol w:w="96"/>
+            </w:tblGrid>
+            <w:tr>
+              <w:trPr>
+                <w:tblCellSpacing w:w="15" w:type="dxa"/>
+              </w:trPr>
+              <w:tc>
+                <w:tcPr>
+                  <w:tcW w:w="0" w:type="auto"/>
+                  <w:vAlign w:val="center"/>
+                  <w:hideMark/>
+                </w:tcPr>
+                <w:p/>
+              </w:tc>
+            </w:tr>
+          </w:tbl>
+          <w:p>
+            <w:pPr>
+              <w:rPr>
+                <w:vanish/>
+              </w:rPr>
+            </w:pPr>
+          </w:p>
+          <w:tbl>
+            <w:tblPr>
+              <w:tblW w:w="0" w:type="auto"/>
+              <w:tblCellSpacing w:w="15" w:type="dxa"/>
+              <w:tblCellMar>
+                <w:top w:w="15" w:type="dxa"/>
+                <w:left w:w="15" w:type="dxa"/>
+                <w:bottom w:w="15" w:type="dxa"/>
+                <w:right w:w="15" w:type="dxa"/>
+              </w:tblCellMar>
+              <w:tblLook w:val="04A0" w:firstRow="1" w:lastRow="0" w:firstColumn="1" w:lastColumn="0" w:noHBand="0" w:noVBand="1"/>
+            </w:tblPr>
+            <w:tblGrid>
+              <w:gridCol w:w="5261"/>
+            </w:tblGrid>
+            <w:tr>
+              <w:trPr>
+                <w:tblCellSpacing w:w="15" w:type="dxa"/>
+              </w:trPr>
+              <w:tc>
+                <w:tcPr>
+                  <w:tcW w:w="0" w:type="auto"/>
+                  <w:vAlign w:val="center"/>
+                  <w:hideMark/>
+                </w:tcPr>
+                <w:p>
+                  <w:r>
+                    <w:t>Multiple Regression, Polynomial Regression, Model Evaluation (RMSE, R²)</w:t>
+                  </w:r>
+                </w:p>
+              </w:tc>
+            </w:tr>
+          </w:tbl>
+          <w:p>
+            <w:pPr>
+              <w:tabs>
+                <w:tab w:val="left" w:pos="1247"/>
+              </w:tabs>
+              <w:rPr>
+                <w:b/>
+                <w:bCs/>
+              </w:rPr>
+            </w:pPr>
+          </w:p>
+        </w:tc>
+      </w:tr>
+      <w:tr>
+        <w:tc>
+          <w:tcPr>
+            <w:tcW w:w="1265" w:type="dxa"/>
+          </w:tcPr>
+          <w:p>
+            <w:pPr>
+              <w:rPr>
+                <w:b/>
+                <w:bCs/>
+              </w:rPr>
+            </w:pPr>
+            <w:r>
+              <w:rPr>
+                <w:b/>
+                <w:bCs/>
+              </w:rPr>
+              <w:t>5</w:t>
+            </w:r>
+          </w:p>
+        </w:tc>
+        <w:tc>
+          <w:tcPr>
+            <w:tcW w:w="2268" w:type="dxa"/>
+          </w:tcPr>
+          <w:tbl>
+            <w:tblPr>
+              <w:tblW w:w="0" w:type="auto"/>
+              <w:tblCellSpacing w:w="15" w:type="dxa"/>
+              <w:tblCellMar>
+                <w:top w:w="15" w:type="dxa"/>
+                <w:left w:w="15" w:type="dxa"/>
+                <w:bottom w:w="15" w:type="dxa"/>
+                <w:right w:w="15" w:type="dxa"/>
+              </w:tblCellMar>
+              <w:tblLook w:val="04A0" w:firstRow="1" w:lastRow="0" w:firstColumn="1" w:lastColumn="0" w:noHBand="0" w:noVBand="1"/>
+            </w:tblPr>
+            <w:tblGrid>
+              <w:gridCol w:w="1477"/>
+            </w:tblGrid>
+            <w:tr>
+              <w:trPr>
+                <w:tblCellSpacing w:w="15" w:type="dxa"/>
+              </w:trPr>
+              <w:tc>
+                <w:tcPr>
+                  <w:tcW w:w="0" w:type="auto"/>
+                  <w:vAlign w:val="center"/>
+                  <w:hideMark/>
+                </w:tcPr>
+                <w:p>
+                  <w:pPr>
+                    <w:jc w:val="center"/>
+                    <w:rPr>
+                      <w:b/>
+                      <w:bCs/>
+                    </w:rPr>
+                  </w:pPr>
+                  <w:r>
+                    <w:rPr>
+                      <w:rStyle w:val="Strong"/>
+                      <w:rFonts w:eastAsiaTheme="majorEastAsia"/>
+                    </w:rPr>
+                    <w:t>Classification</w:t>
+                  </w:r>
+                </w:p>
+              </w:tc>
+            </w:tr>
+          </w:tbl>
+          <w:p>
+            <w:pPr>
+              <w:rPr>
+                <w:vanish/>
+              </w:rPr>
+            </w:pPr>
+          </w:p>
+          <w:tbl>
+            <w:tblPr>
+              <w:tblW w:w="0" w:type="auto"/>
+              <w:tblCellSpacing w:w="15" w:type="dxa"/>
+              <w:tblCellMar>
+                <w:top w:w="15" w:type="dxa"/>
+                <w:left w:w="15" w:type="dxa"/>
+                <w:bottom w:w="15" w:type="dxa"/>
+                <w:right w:w="15" w:type="dxa"/>
+              </w:tblCellMar>
+              <w:tblLook w:val="04A0" w:firstRow="1" w:lastRow="0" w:firstColumn="1" w:lastColumn="0" w:noHBand="0" w:noVBand="1"/>
+            </w:tblPr>
+            <w:tblGrid>
+              <w:gridCol w:w="96"/>
+            </w:tblGrid>
+            <w:tr>
+              <w:trPr>
+                <w:tblCellSpacing w:w="15" w:type="dxa"/>
+              </w:trPr>
+              <w:tc>
+                <w:tcPr>
+                  <w:tcW w:w="0" w:type="auto"/>
+                  <w:vAlign w:val="center"/>
+                  <w:hideMark/>
+                </w:tcPr>
+                <w:p/>
+              </w:tc>
+            </w:tr>
+          </w:tbl>
+          <w:p>
+            <w:pPr>
+              <w:rPr>
+                <w:b/>
+                <w:bCs/>
+              </w:rPr>
+            </w:pPr>
+          </w:p>
+        </w:tc>
+        <w:tc>
+          <w:tcPr>
+            <w:tcW w:w="5477" w:type="dxa"/>
+          </w:tcPr>
+          <w:p>
+            <w:pPr>
+              <w:rPr>
+                <w:b/>
+                <w:bCs/>
+              </w:rPr>
+            </w:pPr>
+            <w:r>
+              <w:t>Classification vs Regression, Logistic Regression, Decision Boundaries</w:t>
+            </w:r>
+          </w:p>
+        </w:tc>
+      </w:tr>
+      <w:tr>
+        <w:tc>
+          <w:tcPr>
+            <w:tcW w:w="1265" w:type="dxa"/>
+          </w:tcPr>
+          <w:p>
+            <w:pPr>
+              <w:rPr>
+                <w:b/>
+                <w:bCs/>
+              </w:rPr>
+            </w:pPr>
+            <w:r>
+              <w:rPr>
+                <w:b/>
+                <w:bCs/>
+              </w:rPr>
+              <w:t>6</w:t>
+            </w:r>
+          </w:p>
+        </w:tc>
+        <w:tc>
+          <w:tcPr>
+            <w:tcW w:w="2268" w:type="dxa"/>
+          </w:tcPr>
+          <w:p>
+            <w:pPr>
+              <w:rPr>
+                <w:b/>
+                <w:bCs/>
+              </w:rPr>
+            </w:pPr>
+            <w:r>
+              <w:rPr>
+                <w:rStyle w:val="Strong"/>
+                <w:rFonts w:eastAsiaTheme="majorEastAsia"/>
+              </w:rPr>
+              <w:t>Classification</w:t>
+            </w:r>
+          </w:p>
+        </w:tc>
+        <w:tc>
+          <w:tcPr>
+            <w:tcW w:w="5477" w:type="dxa"/>
+          </w:tcPr>
+          <w:p>
+            <w:pPr>
+              <w:rPr>
+                <w:b/>
+                <w:bCs/>
+              </w:rPr>
+            </w:pPr>
+            <w:r>
+              <w:t>Decision Trees, Confusion Matrix, Precision-Recall, ROC Curve</w:t>
+            </w:r>
+          </w:p>
+        </w:tc>
+      </w:tr>
+      <w:tr>
+        <w:tc>
+          <w:tcPr>
+            <w:tcW w:w="1265" w:type="dxa"/>
+          </w:tcPr>
+          <w:p>
+            <w:pPr>
+              <w:rPr>
+                <w:b/>
+                <w:bCs/>
+              </w:rPr>
+            </w:pPr>
+            <w:r>
+              <w:rPr>
+                <w:b/>
+                <w:bCs/>
+              </w:rPr>
+              <w:t>7</w:t>
+            </w:r>
+          </w:p>
+        </w:tc>
+        <w:tc>
+          <w:tcPr>
+            <w:tcW w:w="2268" w:type="dxa"/>
+          </w:tcPr>
+          <w:tbl>
+            <w:tblPr>
+              <w:tblW w:w="0" w:type="auto"/>
+              <w:tblCellSpacing w:w="15" w:type="dxa"/>
+              <w:tblCellMar>
+                <w:top w:w="15" w:type="dxa"/>
+                <w:left w:w="15" w:type="dxa"/>
+                <w:bottom w:w="15" w:type="dxa"/>
+                <w:right w:w="15" w:type="dxa"/>
+              </w:tblCellMar>
+              <w:tblLook w:val="04A0" w:firstRow="1" w:lastRow="0" w:firstColumn="1" w:lastColumn="0" w:noHBand="0" w:noVBand="1"/>
+            </w:tblPr>
+            <w:tblGrid>
+              <w:gridCol w:w="2052"/>
+            </w:tblGrid>
+            <w:tr>
+              <w:trPr>
+                <w:tblCellSpacing w:w="15" w:type="dxa"/>
+              </w:trPr>
+              <w:tc>
+                <w:tcPr>
+                  <w:tcW w:w="0" w:type="auto"/>
+                  <w:vAlign w:val="center"/>
+                  <w:hideMark/>
+                </w:tcPr>
+                <w:p>
+                  <w:pPr>
+                    <w:jc w:val="center"/>
+                    <w:rPr>
+                      <w:b/>
+                      <w:bCs/>
+                    </w:rPr>
+                  </w:pPr>
+                  <w:r>
+                    <w:rPr>
+                      <w:rStyle w:val="Strong"/>
+                      <w:rFonts w:eastAsiaTheme="majorEastAsia"/>
+                    </w:rPr>
+                    <w:t>Ensemble &amp; Tuning</w:t>
+                  </w:r>
+                </w:p>
+              </w:tc>
+            </w:tr>
+          </w:tbl>
+          <w:p>
+            <w:pPr>
+              <w:rPr>
+                <w:vanish/>
+              </w:rPr>
+            </w:pPr>
+          </w:p>
+          <w:tbl>
+            <w:tblPr>
+              <w:tblW w:w="0" w:type="auto"/>
+              <w:tblCellSpacing w:w="15" w:type="dxa"/>
+              <w:tblCellMar>
+                <w:top w:w="15" w:type="dxa"/>
+                <w:left w:w="15" w:type="dxa"/>
+                <w:bottom w:w="15" w:type="dxa"/>
+                <w:right w:w="15" w:type="dxa"/>
+              </w:tblCellMar>
+              <w:tblLook w:val="04A0" w:firstRow="1" w:lastRow="0" w:firstColumn="1" w:lastColumn="0" w:noHBand="0" w:noVBand="1"/>
+            </w:tblPr>
+            <w:tblGrid>
+              <w:gridCol w:w="96"/>
+            </w:tblGrid>
+            <w:tr>
+              <w:trPr>
+                <w:tblCellSpacing w:w="15" w:type="dxa"/>
+              </w:trPr>
+              <w:tc>
+                <w:tcPr>
+                  <w:tcW w:w="0" w:type="auto"/>
+                  <w:vAlign w:val="center"/>
+                  <w:hideMark/>
+                </w:tcPr>
+                <w:p/>
+              </w:tc>
+            </w:tr>
+          </w:tbl>
+          <w:p>
+            <w:pPr>
+              <w:rPr>
+                <w:b/>
+                <w:bCs/>
+              </w:rPr>
+            </w:pPr>
+          </w:p>
+        </w:tc>
+        <w:tc>
+          <w:tcPr>
+            <w:tcW w:w="5477" w:type="dxa"/>
+          </w:tcPr>
+          <w:tbl>
+            <w:tblPr>
+              <w:tblW w:w="0" w:type="auto"/>
+              <w:tblCellSpacing w:w="15" w:type="dxa"/>
+              <w:tblCellMar>
+                <w:top w:w="15" w:type="dxa"/>
+                <w:left w:w="15" w:type="dxa"/>
+                <w:bottom w:w="15" w:type="dxa"/>
+                <w:right w:w="15" w:type="dxa"/>
+              </w:tblCellMar>
+              <w:tblLook w:val="04A0" w:firstRow="1" w:lastRow="0" w:firstColumn="1" w:lastColumn="0" w:noHBand="0" w:noVBand="1"/>
+            </w:tblPr>
+            <w:tblGrid>
+              <w:gridCol w:w="96"/>
+            </w:tblGrid>
+            <w:tr>
+              <w:trPr>
+                <w:tblCellSpacing w:w="15" w:type="dxa"/>
+              </w:trPr>
+              <w:tc>
+                <w:tcPr>
+                  <w:tcW w:w="0" w:type="auto"/>
+                  <w:vAlign w:val="center"/>
+                  <w:hideMark/>
+                </w:tcPr>
+                <w:p/>
+              </w:tc>
+            </w:tr>
+          </w:tbl>
+          <w:p>
+            <w:pPr>
+              <w:rPr>
+                <w:vanish/>
+              </w:rPr>
+            </w:pPr>
+          </w:p>
+          <w:tbl>
+            <w:tblPr>
+              <w:tblW w:w="0" w:type="auto"/>
+              <w:tblCellSpacing w:w="15" w:type="dxa"/>
+              <w:tblCellMar>
+                <w:top w:w="15" w:type="dxa"/>
+                <w:left w:w="15" w:type="dxa"/>
+                <w:bottom w:w="15" w:type="dxa"/>
+                <w:right w:w="15" w:type="dxa"/>
+              </w:tblCellMar>
+              <w:tblLook w:val="04A0" w:firstRow="1" w:lastRow="0" w:firstColumn="1" w:lastColumn="0" w:noHBand="0" w:noVBand="1"/>
+            </w:tblPr>
+            <w:tblGrid>
+              <w:gridCol w:w="5261"/>
+            </w:tblGrid>
+            <w:tr>
+              <w:trPr>
+                <w:tblCellSpacing w:w="15" w:type="dxa"/>
+              </w:trPr>
+              <w:tc>
+                <w:tcPr>
+                  <w:tcW w:w="0" w:type="auto"/>
+                  <w:vAlign w:val="center"/>
+                  <w:hideMark/>
+                </w:tcPr>
+                <w:p>
+                  <w:r>
+                    <w:t xml:space="preserve">Ensemble Learning (Random Forest, </w:t>
+                  </w:r>
+                  <w:proofErr w:type="spellStart"/>
+                  <w:r>
+                    <w:t>XGBoost</w:t>
+                  </w:r>
+                  <w:proofErr w:type="spellEnd"/>
+                  <w:r>
+                    <w:t>), Hyperparameter Tuning (</w:t>
+                  </w:r>
+                  <w:proofErr w:type="spellStart"/>
+                  <w:r>
+                    <w:t>GridSearchCV</w:t>
+                  </w:r>
+                  <w:proofErr w:type="spellEnd"/>
+                  <w:r>
+                    <w:t>)</w:t>
+                  </w:r>
+                </w:p>
+              </w:tc>
+            </w:tr>
+          </w:tbl>
+          <w:p>
+            <w:pPr>
+              <w:rPr>
+                <w:b/>
+                <w:bCs/>
+              </w:rPr>
+            </w:pPr>
+          </w:p>
+          <w:p>
+            <w:pPr>
+              <w:tabs>
+                <w:tab w:val="left" w:pos="2125"/>
+              </w:tabs>
+            </w:pPr>
+            <w:r>
+              <w:tab/>
+            </w:r>
+          </w:p>
+        </w:tc>
+      </w:tr>
+      <w:tr>
+        <w:tc>
+          <w:tcPr>
+            <w:tcW w:w="1265" w:type="dxa"/>
+          </w:tcPr>
+          <w:p>
+            <w:pPr>
+              <w:rPr>
+                <w:b/>
+                <w:bCs/>
+              </w:rPr>
+            </w:pPr>
+            <w:r>
+              <w:rPr>
+                <w:b/>
+                <w:bCs/>
+              </w:rPr>
+              <w:t>8</w:t>
+            </w:r>
+          </w:p>
+        </w:tc>
+        <w:tc>
+          <w:tcPr>
+            <w:tcW w:w="2268" w:type="dxa"/>
+          </w:tcPr>
+          <w:p>
+            <w:pPr>
+              <w:rPr>
+                <w:b/>
+                <w:bCs/>
+              </w:rPr>
+            </w:pPr>
+            <w:r>
+              <w:rPr>
+                <w:rStyle w:val="Strong"/>
+                <w:rFonts w:eastAsiaTheme="majorEastAsia"/>
+              </w:rPr>
+              <w:t>Ensemble &amp; Tuning</w:t>
+            </w:r>
+          </w:p>
+        </w:tc>
+        <w:tc>
+          <w:tcPr>
+            <w:tcW w:w="5477" w:type="dxa"/>
+          </w:tcPr>
+          <w:p>
+            <w:pPr>
+              <w:rPr>
+                <w:b/>
+                <w:bCs/>
+              </w:rPr>
+            </w:pPr>
+            <w:r>
+              <w:t>Neural Networks, Introduction to TensorFlow/</w:t>
+            </w:r>
+            <w:proofErr w:type="spellStart"/>
+            <w:r>
+              <w:t>Keras</w:t>
+            </w:r>
+            <w:proofErr w:type="spellEnd"/>
+          </w:p>
+        </w:tc>
+      </w:tr>
+      <w:tr>
+        <w:tc>
+          <w:tcPr>
+            <w:tcW w:w="1265" w:type="dxa"/>
+          </w:tcPr>
+          <w:p>
+            <w:pPr>
+              <w:rPr>
+                <w:b/>
+                <w:bCs/>
+              </w:rPr>
+            </w:pPr>
+            <w:r>
+              <w:rPr>
+                <w:b/>
+                <w:bCs/>
+              </w:rPr>
+              <w:t>9</w:t>
+            </w:r>
+          </w:p>
+        </w:tc>
+        <w:tc>
+          <w:tcPr>
+            <w:tcW w:w="2268" w:type="dxa"/>
+          </w:tcPr>
+          <w:p>
+            <w:pPr>
+              <w:rPr>
+                <w:b/>
+                <w:bCs/>
+              </w:rPr>
+            </w:pPr>
+            <w:r>
+              <w:t>Unsupervised Learning</w:t>
+            </w:r>
+          </w:p>
+        </w:tc>
+        <w:tc>
+          <w:tcPr>
+            <w:tcW w:w="5477" w:type="dxa"/>
+          </w:tcPr>
+          <w:p>
+            <w:pPr>
+              <w:rPr>
+                <w:b/>
+                <w:bCs/>
+              </w:rPr>
+            </w:pPr>
+            <w:r>
+              <w:t>Clustering (K-Means, Hierarchical), PCA</w:t>
+            </w:r>
+          </w:p>
+        </w:tc>
+      </w:tr>
+      <w:tr>
+        <w:tc>
+          <w:tcPr>
+            <w:tcW w:w="1265" w:type="dxa"/>
+          </w:tcPr>
+          <w:p>
+            <w:pPr>
+              <w:rPr>
+                <w:b/>
+                <w:bCs/>
+              </w:rPr>
+            </w:pPr>
+            <w:r>
+              <w:rPr>
+                <w:b/>
+                <w:bCs/>
+              </w:rPr>
+              <w:t>10</w:t>
+            </w:r>
+          </w:p>
+        </w:tc>
+        <w:tc>
+          <w:tcPr>
+            <w:tcW w:w="2268" w:type="dxa"/>
+          </w:tcPr>
+          <w:p>
+            <w:pPr>
+              <w:rPr>
+                <w:b/>
+                <w:bCs/>
+              </w:rPr>
+            </w:pPr>
+            <w:r>
+              <w:t>Feature Engineering</w:t>
+            </w:r>
+          </w:p>
+        </w:tc>
+        <w:tc>
+          <w:tcPr>
+            <w:tcW w:w="5477" w:type="dxa"/>
+          </w:tcPr>
+          <w:tbl>
+            <w:tblPr>
+              <w:tblW w:w="0" w:type="auto"/>
+              <w:tblCellSpacing w:w="15" w:type="dxa"/>
+              <w:tblCellMar>
+                <w:top w:w="15" w:type="dxa"/>
+                <w:left w:w="15" w:type="dxa"/>
+                <w:bottom w:w="15" w:type="dxa"/>
+                <w:right w:w="15" w:type="dxa"/>
+              </w:tblCellMar>
+              <w:tblLook w:val="04A0" w:firstRow="1" w:lastRow="0" w:firstColumn="1" w:lastColumn="0" w:noHBand="0" w:noVBand="1"/>
+            </w:tblPr>
+            <w:tblGrid>
+              <w:gridCol w:w="96"/>
+            </w:tblGrid>
+            <w:tr>
+              <w:trPr>
+                <w:tblCellSpacing w:w="15" w:type="dxa"/>
+              </w:trPr>
+              <w:tc>
+                <w:tcPr>
+                  <w:tcW w:w="0" w:type="auto"/>
+                  <w:vAlign w:val="center"/>
+                  <w:hideMark/>
+                </w:tcPr>
+                <w:p/>
+              </w:tc>
+            </w:tr>
+          </w:tbl>
+          <w:p>
+            <w:pPr>
+              <w:rPr>
+                <w:vanish/>
+              </w:rPr>
+            </w:pPr>
+          </w:p>
+          <w:tbl>
+            <w:tblPr>
+              <w:tblW w:w="0" w:type="auto"/>
+              <w:tblCellSpacing w:w="15" w:type="dxa"/>
+              <w:tblCellMar>
+                <w:top w:w="15" w:type="dxa"/>
+                <w:left w:w="15" w:type="dxa"/>
+                <w:bottom w:w="15" w:type="dxa"/>
+                <w:right w:w="15" w:type="dxa"/>
+              </w:tblCellMar>
+              <w:tblLook w:val="04A0" w:firstRow="1" w:lastRow="0" w:firstColumn="1" w:lastColumn="0" w:noHBand="0" w:noVBand="1"/>
+            </w:tblPr>
+            <w:tblGrid>
+              <w:gridCol w:w="5261"/>
+            </w:tblGrid>
+            <w:tr>
+              <w:trPr>
+                <w:tblCellSpacing w:w="15" w:type="dxa"/>
+              </w:trPr>
+              <w:tc>
+                <w:tcPr>
+                  <w:tcW w:w="0" w:type="auto"/>
+                  <w:vAlign w:val="center"/>
+                  <w:hideMark/>
+                </w:tcPr>
+                <w:p>
+                  <w:r>
+                    <w:t xml:space="preserve">Feature Selection, Feature Engineering, Bias-Variance </w:t>
+                  </w:r>
+                  <w:proofErr w:type="spellStart"/>
+                  <w:r>
+                    <w:t>Tradeoff</w:t>
+                  </w:r>
+                  <w:proofErr w:type="spellEnd"/>
+                </w:p>
+              </w:tc>
+            </w:tr>
+          </w:tbl>
+          <w:p>
+            <w:pPr>
+              <w:rPr>
+                <w:b/>
+                <w:bCs/>
+              </w:rPr>
+            </w:pPr>
+          </w:p>
+        </w:tc>
+      </w:tr>
+      <w:tr>
+        <w:tc>
+          <w:tcPr>
+            <w:tcW w:w="1265" w:type="dxa"/>
+          </w:tcPr>
+          <w:p>
+            <w:pPr>
+              <w:rPr>
+                <w:b/>
+                <w:bCs/>
+              </w:rPr>
+            </w:pPr>
+            <w:r>
+              <w:rPr>
+                <w:b/>
+                <w:bCs/>
+              </w:rPr>
+              <w:t>11</w:t>
+            </w:r>
+          </w:p>
+        </w:tc>
+        <w:tc>
+          <w:tcPr>
+            <w:tcW w:w="2268" w:type="dxa"/>
+          </w:tcPr>
+          <w:p>
+            <w:pPr>
+              <w:rPr>
+                <w:b/>
+                <w:bCs/>
+              </w:rPr>
+            </w:pPr>
+            <w:r>
+              <w:t>Explainability &amp; Deployment</w:t>
+            </w:r>
+          </w:p>
+        </w:tc>
+        <w:tc>
+          <w:tcPr>
+            <w:tcW w:w="5477" w:type="dxa"/>
+          </w:tcPr>
+          <w:tbl>
+            <w:tblPr>
+              <w:tblW w:w="0" w:type="auto"/>
+              <w:tblCellSpacing w:w="15" w:type="dxa"/>
+              <w:tblCellMar>
+                <w:top w:w="15" w:type="dxa"/>
+                <w:left w:w="15" w:type="dxa"/>
+                <w:bottom w:w="15" w:type="dxa"/>
+                <w:right w:w="15" w:type="dxa"/>
+              </w:tblCellMar>
+              <w:tblLook w:val="04A0" w:firstRow="1" w:lastRow="0" w:firstColumn="1" w:lastColumn="0" w:noHBand="0" w:noVBand="1"/>
+            </w:tblPr>
+            <w:tblGrid>
+              <w:gridCol w:w="96"/>
+            </w:tblGrid>
+            <w:tr>
+              <w:trPr>
+                <w:tblCellSpacing w:w="15" w:type="dxa"/>
+              </w:trPr>
+              <w:tc>
+                <w:tcPr>
+                  <w:tcW w:w="0" w:type="auto"/>
+                  <w:vAlign w:val="center"/>
+                  <w:hideMark/>
+                </w:tcPr>
+                <w:p/>
+              </w:tc>
+            </w:tr>
+          </w:tbl>
+          <w:p>
+            <w:pPr>
+              <w:rPr>
+                <w:vanish/>
+              </w:rPr>
+            </w:pPr>
+          </w:p>
+          <w:tbl>
+            <w:tblPr>
+              <w:tblW w:w="0" w:type="auto"/>
+              <w:tblCellSpacing w:w="15" w:type="dxa"/>
+              <w:tblCellMar>
+                <w:top w:w="15" w:type="dxa"/>
+                <w:left w:w="15" w:type="dxa"/>
+                <w:bottom w:w="15" w:type="dxa"/>
+                <w:right w:w="15" w:type="dxa"/>
+              </w:tblCellMar>
+              <w:tblLook w:val="04A0" w:firstRow="1" w:lastRow="0" w:firstColumn="1" w:lastColumn="0" w:noHBand="0" w:noVBand="1"/>
+            </w:tblPr>
+            <w:tblGrid>
+              <w:gridCol w:w="5261"/>
+            </w:tblGrid>
+            <w:tr>
+              <w:trPr>
+                <w:tblCellSpacing w:w="15" w:type="dxa"/>
+              </w:trPr>
+              <w:tc>
+                <w:tcPr>
+                  <w:tcW w:w="0" w:type="auto"/>
+                  <w:vAlign w:val="center"/>
+                  <w:hideMark/>
+                </w:tcPr>
+                <w:p>
+                  <w:r>
+                    <w:t xml:space="preserve">Explainability (SHAP, LIME), Model Deployment (Flask, </w:t>
+                  </w:r>
+                  <w:proofErr w:type="spellStart"/>
+                  <w:r>
+                    <w:t>FastAPI</w:t>
+                  </w:r>
+                  <w:proofErr w:type="spellEnd"/>
+                  <w:r>
+                    <w:t>)</w:t>
+                  </w:r>
+                </w:p>
+              </w:tc>
+            </w:tr>
+          </w:tbl>
+          <w:p>
+            <w:pPr>
+              <w:rPr>
+                <w:b/>
+                <w:bCs/>
+              </w:rPr>
+            </w:pPr>
+          </w:p>
+        </w:tc>
+      </w:tr>
+      <w:tr>
+        <w:tc>
+          <w:tcPr>
+            <w:tcW w:w="1265" w:type="dxa"/>
+          </w:tcPr>
+          <w:p>
+            <w:pPr>
+              <w:rPr>
+                <w:b/>
+                <w:bCs/>
+              </w:rPr>
+            </w:pPr>
+            <w:r>
+              <w:rPr>
+                <w:b/>
+                <w:bCs/>
+              </w:rPr>
+              <w:t>12</w:t>
+            </w:r>
+          </w:p>
+        </w:tc>
+        <w:tc>
+          <w:tcPr>
+            <w:tcW w:w="2268" w:type="dxa"/>
+          </w:tcPr>
+          <w:p>
+            <w:pPr>
+              <w:rPr>
+                <w:b/>
+                <w:bCs/>
+              </w:rPr>
+            </w:pPr>
+            <w:r>
+              <w:t>Capstone Project</w:t>
+            </w:r>
+          </w:p>
+        </w:tc>
+        <w:tc>
+          <w:tcPr>
+            <w:tcW w:w="5477" w:type="dxa"/>
+          </w:tcPr>
+          <w:p>
+            <w:pPr>
+              <w:rPr>
+                <w:b/>
+                <w:bCs/>
+              </w:rPr>
+            </w:pPr>
+            <w:r>
+              <w:t>End-to-End Capstone Project</w:t>
+            </w:r>
+          </w:p>
+        </w:tc>
+      </w:tr>
+    </w:tbl>
+    <w:p>
+      <w:pPr>
+        <w:rPr>
+          <w:b/>
+          <w:bCs/>
+        </w:rPr>
+      </w:pPr>
+    </w:p>
+    <w:p>
+      <w:pPr>
+        <w:rPr>
+          <w:b/>
+          <w:bCs/>
+        </w:rPr>
+      </w:pPr>
+    </w:p>
+    <w:p>
+      <w:pPr>
+        <w:rPr>
+          <w:b/>
+          <w:bCs/>
+        </w:rPr>
+      </w:pPr>
+    </w:p>
+    <w:p>
+      <w:pPr>
+        <w:rPr>
+          <w:b/>
+          <w:bCs/>
+        </w:rPr>
+      </w:pPr>
+    </w:p>
     <w:p>
       <w:pPr>
         <w:rPr>
@@ -152,14 +1499,34 @@
               <w:rPr>
                 <w:b/>
                 <w:bCs/>
-              </w:rPr>
-            </w:pPr>
-            <w:r>
-              <w:rPr>
-                <w:b/>
-                <w:bCs/>
-              </w:rPr>
-              <w:t>Understanding Generative AI (GenAI) &amp; RAG Models</w:t>
+                <w:lang w:val="de-DE"/>
+              </w:rPr>
+            </w:pPr>
+            <w:r>
+              <w:rPr>
+                <w:b/>
+                <w:bCs/>
+                <w:lang w:val="de-DE"/>
+              </w:rPr>
+              <w:t>Understanding Generative AI (</w:t>
+            </w:r>
+            <w:proofErr w:type="spellStart"/>
+            <w:r>
+              <w:rPr>
+                <w:b/>
+                <w:bCs/>
+                <w:lang w:val="de-DE"/>
+              </w:rPr>
+              <w:t>GenAI</w:t>
+            </w:r>
+            <w:proofErr w:type="spellEnd"/>
+            <w:r>
+              <w:rPr>
+                <w:b/>
+                <w:bCs/>
+                <w:lang w:val="de-DE"/>
+              </w:rPr>
+              <w:t>) &amp; RAG Models</w:t>
             </w:r>
           </w:p>
         </w:tc>
@@ -170,7 +1537,15 @@
           </w:tcPr>
           <w:p>
             <w:r>
-              <w:t>Basics of GenAI, LLMs, embeddings, RAG principles.</w:t>
+              <w:t xml:space="preserve">Basics of </w:t>
+            </w:r>
+            <w:proofErr w:type="spellStart"/>
+            <w:r>
+              <w:t>GenAI</w:t>
+            </w:r>
+            <w:proofErr w:type="spellEnd"/>
+            <w:r>
+              <w:t>, LLMs, embeddings, RAG principles.</w:t>
             </w:r>
           </w:p>
         </w:tc>
@@ -428,6 +1803,7 @@
                 <w:b/>
                 <w:bCs/>
               </w:rPr>
+              <w:lastRenderedPageBreak/>
               <w:t>7</w:t>
             </w:r>
           </w:p>
@@ -1621,6 +2997,16 @@
   <w:style w:type="paragraph" w:default="1" w:styleId="Normal">
     <w:name w:val="Normal"/>
     <w:qFormat/>
+    <w:rsid w:val="000E1279"/>
+    <w:pPr>
+      <w:spacing w:after="0" w:line="240" w:lineRule="auto"/>
+    </w:pPr>
+    <w:rPr>
+      <w:rFonts w:ascii="Times New Roman" w:eastAsia="Times New Roman" w:hAnsi="Times New Roman" w:cs="Times New Roman"/>
+      <w:kern w:val="0"/>
+      <w:lang w:eastAsia="en-GB" w:bidi="kn-IN"/>
+      <w14:ligatures w14:val="none"/>
+    </w:rPr>
   </w:style>
   <w:style w:type="paragraph" w:styleId="Heading1">
     <w:name w:val="heading 1"/>
@@ -1633,14 +3019,17 @@
     <w:pPr>
       <w:keepNext/>
       <w:keepLines/>
-      <w:spacing w:before="360" w:after="80"/>
+      <w:spacing w:before="360" w:after="80" w:line="278" w:lineRule="auto"/>
       <w:outlineLvl w:val="0"/>
     </w:pPr>
     <w:rPr>
       <w:rFonts w:asciiTheme="majorHAnsi" w:eastAsiaTheme="majorEastAsia" w:hAnsiTheme="majorHAnsi" w:cstheme="majorBidi"/>
       <w:color w:val="2F5496" w:themeColor="accent1" w:themeShade="BF"/>
+      <w:kern w:val="2"/>
       <w:sz w:val="40"/>
       <w:szCs w:val="40"/>
+      <w:lang w:eastAsia="en-US" w:bidi="ar-SA"/>
+      <w14:ligatures w14:val="standardContextual"/>
     </w:rPr>
   </w:style>
   <w:style w:type="paragraph" w:styleId="Heading2">
@@ -1656,14 +3045,17 @@
     <w:pPr>
       <w:keepNext/>
       <w:keepLines/>
-      <w:spacing w:before="160" w:after="80"/>
+      <w:spacing w:before="160" w:after="80" w:line="278" w:lineRule="auto"/>
       <w:outlineLvl w:val="1"/>
     </w:pPr>
     <w:rPr>
       <w:rFonts w:asciiTheme="majorHAnsi" w:eastAsiaTheme="majorEastAsia" w:hAnsiTheme="majorHAnsi" w:cstheme="majorBidi"/>
       <w:color w:val="2F5496" w:themeColor="accent1" w:themeShade="BF"/>
+      <w:kern w:val="2"/>
       <w:sz w:val="32"/>
       <w:szCs w:val="32"/>
+      <w:lang w:eastAsia="en-US" w:bidi="ar-SA"/>
+      <w14:ligatures w14:val="standardContextual"/>
     </w:rPr>
   </w:style>
   <w:style w:type="paragraph" w:styleId="Heading3">
@@ -1679,14 +3071,17 @@
     <w:pPr>
       <w:keepNext/>
       <w:keepLines/>
-      <w:spacing w:before="160" w:after="80"/>
+      <w:spacing w:before="160" w:after="80" w:line="278" w:lineRule="auto"/>
       <w:outlineLvl w:val="2"/>
     </w:pPr>
     <w:rPr>
-      <w:rFonts w:eastAsiaTheme="majorEastAsia" w:cstheme="majorBidi"/>
+      <w:rFonts w:asciiTheme="minorHAnsi" w:eastAsiaTheme="majorEastAsia" w:hAnsiTheme="minorHAnsi" w:cstheme="majorBidi"/>
       <w:color w:val="2F5496" w:themeColor="accent1" w:themeShade="BF"/>
+      <w:kern w:val="2"/>
       <w:sz w:val="28"/>
       <w:szCs w:val="28"/>
+      <w:lang w:eastAsia="en-US" w:bidi="ar-SA"/>
+      <w14:ligatures w14:val="standardContextual"/>
     </w:rPr>
   </w:style>
   <w:style w:type="paragraph" w:styleId="Heading4">
@@ -1702,14 +3097,17 @@
     <w:pPr>
       <w:keepNext/>
       <w:keepLines/>
-      <w:spacing w:before="80" w:after="40"/>
+      <w:spacing w:before="80" w:after="40" w:line="278" w:lineRule="auto"/>
       <w:outlineLvl w:val="3"/>
     </w:pPr>
     <w:rPr>
-      <w:rFonts w:eastAsiaTheme="majorEastAsia" w:cstheme="majorBidi"/>
+      <w:rFonts w:asciiTheme="minorHAnsi" w:eastAsiaTheme="majorEastAsia" w:hAnsiTheme="minorHAnsi" w:cstheme="majorBidi"/>
       <w:i/>
       <w:iCs/>
       <w:color w:val="2F5496" w:themeColor="accent1" w:themeShade="BF"/>
+      <w:kern w:val="2"/>
+      <w:lang w:eastAsia="en-US" w:bidi="ar-SA"/>
+      <w14:ligatures w14:val="standardContextual"/>
     </w:rPr>
   </w:style>
   <w:style w:type="paragraph" w:styleId="Heading5">
@@ -1725,12 +3123,15 @@
     <w:pPr>
       <w:keepNext/>
       <w:keepLines/>
-      <w:spacing w:before="80" w:after="40"/>
+      <w:spacing w:before="80" w:after="40" w:line="278" w:lineRule="auto"/>
       <w:outlineLvl w:val="4"/>
     </w:pPr>
     <w:rPr>
-      <w:rFonts w:eastAsiaTheme="majorEastAsia" w:cstheme="majorBidi"/>
+      <w:rFonts w:asciiTheme="minorHAnsi" w:eastAsiaTheme="majorEastAsia" w:hAnsiTheme="minorHAnsi" w:cstheme="majorBidi"/>
       <w:color w:val="2F5496" w:themeColor="accent1" w:themeShade="BF"/>
+      <w:kern w:val="2"/>
+      <w:lang w:eastAsia="en-US" w:bidi="ar-SA"/>
+      <w14:ligatures w14:val="standardContextual"/>
     </w:rPr>
   </w:style>
   <w:style w:type="paragraph" w:styleId="Heading6">
@@ -1746,14 +3147,17 @@
     <w:pPr>
       <w:keepNext/>
       <w:keepLines/>
-      <w:spacing w:before="40" w:after="0"/>
+      <w:spacing w:before="40" w:line="278" w:lineRule="auto"/>
       <w:outlineLvl w:val="5"/>
     </w:pPr>
     <w:rPr>
-      <w:rFonts w:eastAsiaTheme="majorEastAsia" w:cstheme="majorBidi"/>
+      <w:rFonts w:asciiTheme="minorHAnsi" w:eastAsiaTheme="majorEastAsia" w:hAnsiTheme="minorHAnsi" w:cstheme="majorBidi"/>
       <w:i/>
       <w:iCs/>
       <w:color w:val="595959" w:themeColor="text1" w:themeTint="A6"/>
+      <w:kern w:val="2"/>
+      <w:lang w:eastAsia="en-US" w:bidi="ar-SA"/>
+      <w14:ligatures w14:val="standardContextual"/>
     </w:rPr>
   </w:style>
   <w:style w:type="paragraph" w:styleId="Heading7">
@@ -1769,12 +3173,15 @@
     <w:pPr>
       <w:keepNext/>
       <w:keepLines/>
-      <w:spacing w:before="40" w:after="0"/>
+      <w:spacing w:before="40" w:line="278" w:lineRule="auto"/>
       <w:outlineLvl w:val="6"/>
     </w:pPr>
     <w:rPr>
-      <w:rFonts w:eastAsiaTheme="majorEastAsia" w:cstheme="majorBidi"/>
+      <w:rFonts w:asciiTheme="minorHAnsi" w:eastAsiaTheme="majorEastAsia" w:hAnsiTheme="minorHAnsi" w:cstheme="majorBidi"/>
       <w:color w:val="595959" w:themeColor="text1" w:themeTint="A6"/>
+      <w:kern w:val="2"/>
+      <w:lang w:eastAsia="en-US" w:bidi="ar-SA"/>
+      <w14:ligatures w14:val="standardContextual"/>
     </w:rPr>
   </w:style>
   <w:style w:type="paragraph" w:styleId="Heading8">
@@ -1790,14 +3197,17 @@
     <w:pPr>
       <w:keepNext/>
       <w:keepLines/>
-      <w:spacing w:after="0"/>
+      <w:spacing w:line="278" w:lineRule="auto"/>
       <w:outlineLvl w:val="7"/>
     </w:pPr>
     <w:rPr>
-      <w:rFonts w:eastAsiaTheme="majorEastAsia" w:cstheme="majorBidi"/>
+      <w:rFonts w:asciiTheme="minorHAnsi" w:eastAsiaTheme="majorEastAsia" w:hAnsiTheme="minorHAnsi" w:cstheme="majorBidi"/>
       <w:i/>
       <w:iCs/>
       <w:color w:val="272727" w:themeColor="text1" w:themeTint="D8"/>
+      <w:kern w:val="2"/>
+      <w:lang w:eastAsia="en-US" w:bidi="ar-SA"/>
+      <w14:ligatures w14:val="standardContextual"/>
     </w:rPr>
   </w:style>
   <w:style w:type="paragraph" w:styleId="Heading9">
@@ -1813,17 +3223,21 @@
     <w:pPr>
       <w:keepNext/>
       <w:keepLines/>
-      <w:spacing w:after="0"/>
+      <w:spacing w:line="278" w:lineRule="auto"/>
       <w:outlineLvl w:val="8"/>
     </w:pPr>
     <w:rPr>
-      <w:rFonts w:eastAsiaTheme="majorEastAsia" w:cstheme="majorBidi"/>
+      <w:rFonts w:asciiTheme="minorHAnsi" w:eastAsiaTheme="majorEastAsia" w:hAnsiTheme="minorHAnsi" w:cstheme="majorBidi"/>
       <w:color w:val="272727" w:themeColor="text1" w:themeTint="D8"/>
+      <w:kern w:val="2"/>
+      <w:lang w:eastAsia="en-US" w:bidi="ar-SA"/>
+      <w14:ligatures w14:val="standardContextual"/>
     </w:rPr>
   </w:style>
   <w:style w:type="character" w:default="1" w:styleId="DefaultParagraphFont">
     <w:name w:val="Default Paragraph Font"/>
     <w:uiPriority w:val="1"/>
+    <w:semiHidden/>
     <w:unhideWhenUsed/>
   </w:style>
   <w:style w:type="table" w:default="1" w:styleId="TableNormal">
@@ -1975,7 +3389,7 @@
     <w:qFormat/>
     <w:rsid w:val="00E64C90"/>
     <w:pPr>
-      <w:spacing w:after="80" w:line="240" w:lineRule="auto"/>
+      <w:spacing w:after="80"/>
       <w:contextualSpacing/>
     </w:pPr>
     <w:rPr>
@@ -1984,6 +3398,8 @@
       <w:kern w:val="28"/>
       <w:sz w:val="56"/>
       <w:szCs w:val="56"/>
+      <w:lang w:eastAsia="en-US" w:bidi="ar-SA"/>
+      <w14:ligatures w14:val="standardContextual"/>
     </w:rPr>
   </w:style>
   <w:style w:type="character" w:customStyle="1" w:styleId="TitleChar">
@@ -2012,13 +3428,17 @@
       <w:numPr>
         <w:ilvl w:val="1"/>
       </w:numPr>
+      <w:spacing w:after="160" w:line="278" w:lineRule="auto"/>
     </w:pPr>
     <w:rPr>
-      <w:rFonts w:eastAsiaTheme="majorEastAsia" w:cstheme="majorBidi"/>
+      <w:rFonts w:asciiTheme="minorHAnsi" w:eastAsiaTheme="majorEastAsia" w:hAnsiTheme="minorHAnsi" w:cstheme="majorBidi"/>
       <w:color w:val="595959" w:themeColor="text1" w:themeTint="A6"/>
       <w:spacing w:val="15"/>
+      <w:kern w:val="2"/>
       <w:sz w:val="28"/>
       <w:szCs w:val="28"/>
+      <w:lang w:eastAsia="en-US" w:bidi="ar-SA"/>
+      <w14:ligatures w14:val="standardContextual"/>
     </w:rPr>
   </w:style>
   <w:style w:type="character" w:customStyle="1" w:styleId="SubtitleChar">
@@ -2044,13 +3464,17 @@
     <w:qFormat/>
     <w:rsid w:val="00E64C90"/>
     <w:pPr>
-      <w:spacing w:before="160"/>
+      <w:spacing w:before="160" w:after="160" w:line="278" w:lineRule="auto"/>
       <w:jc w:val="center"/>
     </w:pPr>
     <w:rPr>
+      <w:rFonts w:asciiTheme="minorHAnsi" w:eastAsiaTheme="minorHAnsi" w:hAnsiTheme="minorHAnsi" w:cstheme="minorBidi"/>
       <w:i/>
       <w:iCs/>
       <w:color w:val="404040" w:themeColor="text1" w:themeTint="BF"/>
+      <w:kern w:val="2"/>
+      <w:lang w:eastAsia="en-US" w:bidi="ar-SA"/>
+      <w14:ligatures w14:val="standardContextual"/>
     </w:rPr>
   </w:style>
   <w:style w:type="character" w:customStyle="1" w:styleId="QuoteChar">
@@ -2072,9 +3496,16 @@
     <w:qFormat/>
     <w:rsid w:val="00E64C90"/>
     <w:pPr>
+      <w:spacing w:after="160" w:line="278" w:lineRule="auto"/>
       <w:ind w:left="720"/>
       <w:contextualSpacing/>
     </w:pPr>
+    <w:rPr>
+      <w:rFonts w:asciiTheme="minorHAnsi" w:eastAsiaTheme="minorHAnsi" w:hAnsiTheme="minorHAnsi" w:cstheme="minorBidi"/>
+      <w:kern w:val="2"/>
+      <w:lang w:eastAsia="en-US" w:bidi="ar-SA"/>
+      <w14:ligatures w14:val="standardContextual"/>
+    </w:rPr>
   </w:style>
   <w:style w:type="character" w:styleId="IntenseEmphasis">
     <w:name w:val="Intense Emphasis"/>
@@ -2101,14 +3532,18 @@
         <w:top w:val="single" w:sz="4" w:space="10" w:color="2F5496" w:themeColor="accent1" w:themeShade="BF"/>
         <w:bottom w:val="single" w:sz="4" w:space="10" w:color="2F5496" w:themeColor="accent1" w:themeShade="BF"/>
       </w:pBdr>
-      <w:spacing w:before="360" w:after="360"/>
+      <w:spacing w:before="360" w:after="360" w:line="278" w:lineRule="auto"/>
       <w:ind w:left="864" w:right="864"/>
       <w:jc w:val="center"/>
     </w:pPr>
     <w:rPr>
+      <w:rFonts w:asciiTheme="minorHAnsi" w:eastAsiaTheme="minorHAnsi" w:hAnsiTheme="minorHAnsi" w:cstheme="minorBidi"/>
       <w:i/>
       <w:iCs/>
       <w:color w:val="2F5496" w:themeColor="accent1" w:themeShade="BF"/>
+      <w:kern w:val="2"/>
+      <w:lang w:eastAsia="en-US" w:bidi="ar-SA"/>
+      <w14:ligatures w14:val="standardContextual"/>
     </w:rPr>
   </w:style>
   <w:style w:type="character" w:customStyle="1" w:styleId="IntenseQuoteChar">
@@ -2178,6 +3613,17 @@
         <w:insideV w:val="single" w:sz="4" w:space="0" w:color="auto"/>
       </w:tblBorders>
     </w:tblPr>
+  </w:style>
+  <w:style w:type="character" w:styleId="Strong">
+    <w:name w:val="Strong"/>
+    <w:basedOn w:val="DefaultParagraphFont"/>
+    <w:uiPriority w:val="22"/>
+    <w:qFormat/>
+    <w:rsid w:val="000E1279"/>
+    <w:rPr>
+      <w:b/>
+      <w:bCs/>
+    </w:rPr>
   </w:style>
 </w:styles>
 </file>

</xml_diff>